<commit_message>
check Intro aux DB et DrawIo
</commit_message>
<xml_diff>
--- a/Intro_Bases_de_donnees/Introduction_aux_bases_de_donnees.docx
+++ b/Intro_Bases_de_donnees/Introduction_aux_bases_de_donnees.docx
@@ -4888,14 +4888,14 @@
         <w:rPr>
           <w:rStyle w:val="eop"/>
           <w:rFonts w:ascii="Aptos" w:eastAsiaTheme="majorEastAsia" w:hAnsi="Aptos" w:cs="Segoe UI"/>
-          <w:lang w:val="fr-FR"/>
+          <w:lang w:val="en-US"/>
         </w:rPr>
       </w:pPr>
       <w:r>
         <w:rPr>
           <w:rStyle w:val="normaltextrun"/>
           <w:rFonts w:ascii="Aptos" w:eastAsiaTheme="majorEastAsia" w:hAnsi="Aptos" w:cs="Segoe UI"/>
-          <w:lang w:val="fr-FR"/>
+          <w:lang w:val="en-US"/>
         </w:rPr>
         <w:t>)</w:t>
       </w:r>
@@ -4903,7 +4903,7 @@
         <w:rPr>
           <w:rStyle w:val="eop"/>
           <w:rFonts w:ascii="Aptos" w:eastAsiaTheme="majorEastAsia" w:hAnsi="Aptos" w:cs="Segoe UI"/>
-          <w:lang w:val="fr-FR"/>
+          <w:lang w:val="en-US"/>
         </w:rPr>
         <w:t> </w:t>
       </w:r>
@@ -4916,11 +4916,16 @@
         <w:rPr>
           <w:rStyle w:val="eop"/>
           <w:rFonts w:ascii="Aptos" w:eastAsiaTheme="majorEastAsia" w:hAnsi="Aptos" w:cs="Segoe UI"/>
-          <w:lang w:val="fr-FR"/>
-        </w:rPr>
-      </w:pPr>
-    </w:p>
-    <w:p>
+          <w:lang w:val="en-US"/>
+        </w:rPr>
+      </w:pPr>
+    </w:p>
+    <w:p>
+      <w:pPr>
+        <w:rPr>
+          <w:lang w:val="en-US"/>
+        </w:rPr>
+      </w:pPr>
       <w:r>
         <w:rPr>
           <w:lang w:val="en-US"/>
@@ -4929,12 +4934,9 @@
       </w:r>
       <w:r>
         <w:rPr>
-          <w:lang w:val="fr-FR"/>
-        </w:rPr>
-        <w:t>https://openclassrooms.com/fr/courses/7818671-requetez-une-base-de-donnees-avec-sql</w:t>
-      </w:r>
-      <w:r>
-        <w:t> </w:t>
+          <w:lang w:val="en-US"/>
+        </w:rPr>
+        <w:t>https://openclassrooms.com/fr/courses/7818671-requetez-une-base-de-donnees-avec-sql </w:t>
       </w:r>
     </w:p>
     <w:p>
@@ -4942,7 +4944,7 @@
         <w:rPr>
           <w:b/>
           <w:bCs/>
-          <w:lang w:val="fr-FR"/>
+          <w:lang w:val="en-US"/>
         </w:rPr>
       </w:pPr>
     </w:p>
@@ -5601,23 +5603,13 @@
         <w:t>flexibles</w:t>
       </w:r>
       <w:r>
-        <w:t xml:space="preserve">.On ne parle plus de table </w:t>
-      </w:r>
-      <w:proofErr w:type="spellStart"/>
-      <w:r>
-        <w:t>smais</w:t>
-      </w:r>
-      <w:proofErr w:type="spellEnd"/>
-      <w:r>
-        <w:t xml:space="preserve"> de </w:t>
-      </w:r>
-      <w:proofErr w:type="spellStart"/>
-      <w:r>
-        <w:t>documùents</w:t>
-      </w:r>
-      <w:proofErr w:type="spellEnd"/>
-      <w:r>
-        <w:t>, car on va manipuler du JSON.</w:t>
+        <w:t>.On ne parle plus de tables</w:t>
+      </w:r>
+      <w:r>
+        <w:t xml:space="preserve"> </w:t>
+      </w:r>
+      <w:r>
+        <w:t>mais de documents, car on va manipuler du JSON.</w:t>
       </w:r>
       <w:r>
         <w:t xml:space="preserve"> On peut nous-même imaginer des relations entre nos éléments, mais cette relation ne sera pas </w:t>
@@ -5980,78 +5972,32 @@
       </w:r>
     </w:p>
     <w:p>
-      <w:pPr>
-        <w:rPr>
-          <w:lang w:val="en-US"/>
-        </w:rPr>
-      </w:pPr>
-      <w:r>
-        <w:rPr>
-          <w:lang w:val="en-US"/>
-        </w:rPr>
+      <w:r>
         <w:t>Insertion d</w:t>
       </w:r>
       <w:r>
-        <w:rPr>
-          <w:lang w:val="en-US"/>
-        </w:rPr>
         <w:t xml:space="preserve">e </w:t>
       </w:r>
-      <w:proofErr w:type="spellStart"/>
-      <w:r>
-        <w:rPr>
-          <w:lang w:val="en-US"/>
-        </w:rPr>
-        <w:t>plusieurs</w:t>
-      </w:r>
-      <w:proofErr w:type="spellEnd"/>
-      <w:r>
-        <w:rPr>
-          <w:lang w:val="en-US"/>
-        </w:rPr>
-        <w:t xml:space="preserve"> </w:t>
-      </w:r>
-      <w:proofErr w:type="spellStart"/>
-      <w:r>
-        <w:rPr>
-          <w:lang w:val="en-US"/>
-        </w:rPr>
-        <w:t>éléments</w:t>
-      </w:r>
-      <w:proofErr w:type="spellEnd"/>
-      <w:r>
-        <w:rPr>
-          <w:lang w:val="en-US"/>
-        </w:rPr>
-        <w:t xml:space="preserve"> :</w:t>
+      <w:r>
+        <w:t>plusieurs éléments :</w:t>
       </w:r>
     </w:p>
     <w:p>
       <w:pPr>
         <w:ind w:left="708"/>
-        <w:rPr>
-          <w:lang w:val="en-US"/>
-        </w:rPr>
-      </w:pPr>
-      <w:proofErr w:type="spellStart"/>
-      <w:r>
-        <w:rPr>
-          <w:lang w:val="en-US"/>
-        </w:rPr>
+      </w:pPr>
+      <w:proofErr w:type="spellStart"/>
+      <w:r>
         <w:t>db</w:t>
       </w:r>
       <w:proofErr w:type="spellEnd"/>
       <w:r>
-        <w:rPr>
-          <w:lang w:val="en-US"/>
-        </w:rPr>
         <w:t>["User"]</w:t>
       </w:r>
       <w:r>
         <w:rPr>
           <w:b/>
           <w:bCs/>
-          <w:lang w:val="en-US"/>
         </w:rPr>
         <w:t>.</w:t>
       </w:r>
@@ -6060,113 +6006,73 @@
         <w:rPr>
           <w:b/>
           <w:bCs/>
-          <w:lang w:val="en-US"/>
         </w:rPr>
         <w:t>insertMany</w:t>
       </w:r>
       <w:proofErr w:type="spellEnd"/>
       <w:r>
-        <w:rPr>
-          <w:lang w:val="en-US"/>
-        </w:rPr>
         <w:t xml:space="preserve"> ( [ {</w:t>
       </w:r>
       <w:proofErr w:type="spellStart"/>
       <w:r>
-        <w:rPr>
-          <w:lang w:val="en-US"/>
-        </w:rPr>
         <w:t>lastname</w:t>
       </w:r>
       <w:proofErr w:type="spellEnd"/>
       <w:r>
-        <w:rPr>
-          <w:lang w:val="en-US"/>
-        </w:rPr>
         <w:t xml:space="preserve"> : "</w:t>
       </w:r>
       <w:proofErr w:type="spellStart"/>
       <w:r>
-        <w:rPr>
-          <w:lang w:val="en-US"/>
-        </w:rPr>
         <w:t>Squarepants</w:t>
       </w:r>
       <w:proofErr w:type="spellEnd"/>
       <w:r>
-        <w:rPr>
-          <w:lang w:val="en-US"/>
-        </w:rPr>
         <w:t xml:space="preserve">", </w:t>
       </w:r>
       <w:proofErr w:type="spellStart"/>
       <w:r>
-        <w:rPr>
-          <w:lang w:val="en-US"/>
-        </w:rPr>
         <w:t>firstname</w:t>
       </w:r>
       <w:proofErr w:type="spellEnd"/>
       <w:r>
-        <w:rPr>
-          <w:lang w:val="en-US"/>
-        </w:rPr>
-        <w:t xml:space="preserve"> : "SpongeBob"}, {</w:t>
-      </w:r>
-      <w:proofErr w:type="spellStart"/>
-      <w:r>
-        <w:rPr>
-          <w:lang w:val="en-US"/>
-        </w:rPr>
+        <w:t xml:space="preserve"> : "</w:t>
+      </w:r>
+      <w:proofErr w:type="spellStart"/>
+      <w:r>
+        <w:t>SpongeBob</w:t>
+      </w:r>
+      <w:proofErr w:type="spellEnd"/>
+      <w:r>
+        <w:t>"}, {</w:t>
+      </w:r>
+      <w:proofErr w:type="spellStart"/>
+      <w:r>
         <w:t>lastname</w:t>
       </w:r>
       <w:proofErr w:type="spellEnd"/>
       <w:r>
-        <w:rPr>
-          <w:lang w:val="en-US"/>
-        </w:rPr>
-        <w:t xml:space="preserve"> : "Starfish", </w:t>
-      </w:r>
-      <w:proofErr w:type="spellStart"/>
-      <w:r>
-        <w:rPr>
-          <w:lang w:val="en-US"/>
-        </w:rPr>
+        <w:t xml:space="preserve"> : "</w:t>
+      </w:r>
+      <w:proofErr w:type="spellStart"/>
+      <w:r>
+        <w:t>Starfish</w:t>
+      </w:r>
+      <w:proofErr w:type="spellEnd"/>
+      <w:r>
+        <w:t xml:space="preserve">", </w:t>
+      </w:r>
+      <w:proofErr w:type="spellStart"/>
+      <w:r>
         <w:t>firstname</w:t>
       </w:r>
       <w:proofErr w:type="spellEnd"/>
       <w:r>
-        <w:rPr>
-          <w:lang w:val="en-US"/>
-        </w:rPr>
         <w:t xml:space="preserve"> : "Patrick"} ] )</w:t>
       </w:r>
     </w:p>
     <w:p>
-      <w:pPr>
-        <w:rPr>
-          <w:lang w:val="en-US"/>
-        </w:rPr>
-      </w:pPr>
-      <w:r>
-        <w:rPr>
-          <w:lang w:val="en-US"/>
-        </w:rPr>
-        <w:t xml:space="preserve">Recherche d’un </w:t>
-      </w:r>
-      <w:proofErr w:type="spellStart"/>
-      <w:r>
-        <w:rPr>
-          <w:lang w:val="en-US"/>
-        </w:rPr>
-        <w:t>élément</w:t>
-      </w:r>
-      <w:proofErr w:type="spellEnd"/>
-      <w:r>
-        <w:rPr>
-          <w:lang w:val="en-US"/>
-        </w:rPr>
-        <w:t xml:space="preserve"> :</w:t>
+      <w:r>
+        <w:t>Recherche d’un élément :</w:t>
       </w:r>
     </w:p>
     <w:p>
@@ -6238,51 +6144,14 @@
       </w:r>
     </w:p>
     <w:p>
-      <w:pPr>
-        <w:rPr>
-          <w:lang w:val="en-US"/>
-        </w:rPr>
-      </w:pPr>
-      <w:r>
-        <w:rPr>
-          <w:lang w:val="en-US"/>
-        </w:rPr>
-        <w:t xml:space="preserve">Update d’un </w:t>
-      </w:r>
-      <w:proofErr w:type="spellStart"/>
-      <w:r>
-        <w:rPr>
-          <w:lang w:val="en-US"/>
-        </w:rPr>
-        <w:t>élément</w:t>
-      </w:r>
-      <w:proofErr w:type="spellEnd"/>
-      <w:r>
-        <w:rPr>
-          <w:lang w:val="en-US"/>
-        </w:rPr>
-        <w:t xml:space="preserve"> :</w:t>
-      </w:r>
-    </w:p>
-    <w:p>
-      <w:pPr>
-        <w:rPr>
-          <w:lang w:val="en-US"/>
-        </w:rPr>
-      </w:pPr>
-    </w:p>
-    <w:p>
-      <w:pPr>
-        <w:rPr>
-          <w:lang w:val="en-US"/>
-        </w:rPr>
-      </w:pPr>
-    </w:p>
-    <w:p>
-      <w:r>
-        <w:rPr>
-          <w:lang w:val="en-US"/>
-        </w:rPr>
+      <w:r>
+        <w:t>Update d’un élément :</w:t>
+      </w:r>
+    </w:p>
+    <w:p/>
+    <w:p/>
+    <w:p>
+      <w:r>
         <w:br/>
       </w:r>
       <w:r>
@@ -7118,6 +6987,7 @@
   <w:style w:type="character" w:default="1" w:styleId="DefaultParagraphFont">
     <w:name w:val="Default Paragraph Font"/>
     <w:uiPriority w:val="1"/>
+    <w:semiHidden/>
     <w:unhideWhenUsed/>
   </w:style>
   <w:style w:type="table" w:default="1" w:styleId="TableNormal">

</xml_diff>